<commit_message>
Reuse PillarsHub Portal and back office; add design prompt
- Solution (EN and VI): MLM administration (genealogy, placements, plan,
  bonuses, period close, release) stays in the PillarsHub Portal;
  Builders get essentials in Helm plus SSO into PillarsHub's back office.
  New decision D13, Sponsor-change detection and approval note, SSO token
  risk, and PillarsHub questions 13-14
- prompts/Claude-Design-Prompt.md: UI design brief for the Pilot,
  scoped to what Helm builds and the PillarsHub hand-offs

Co-Authored-By: Claude Opus 5.5 <noreply@anthropic.com>
</commit_message>
<xml_diff>
--- a/outputs/Helm-Phase-0-Solution-2026-10-09-vi.docx
+++ b/outputs/Helm-Phase-0-Solution-2026-10-09-vi.docx
@@ -834,6 +834,59 @@
           <w:lang w:val="vi"/>
         </w:rPr>
         <w:t xml:space="preserve">Privy lo login và wallet; PillarsHub lưu Genealogy và tính Commission bằng Unilevel plan hiện có; Onyx phát hành vault share và chạy deposit queue, redeem queue; Chatwoot xử lý hội thoại.</w:t>
+      </w:r>
+    </w:p>
+    <w:p>
+      <w:pPr>
+        <w:pStyle w:val="Compact"/>
+        <w:numPr>
+          <w:ilvl w:val="0"/>
+          <w:numId w:val="1002"/>
+        </w:numPr>
+      </w:pPr>
+      <w:r>
+        <w:rPr>
+          <w:b/>
+          <w:bCs/>
+          <w:lang w:val="vi"/>
+        </w:rPr>
+        <w:t xml:space="preserve">Màn hình MLM được tái sử dụng, không build lại.</w:t>
+      </w:r>
+      <w:r>
+        <w:rPr>
+          <w:lang w:val="vi"/>
+        </w:rPr>
+        <w:t xml:space="preserve"> </w:t>
+      </w:r>
+      <w:r>
+        <w:rPr>
+          <w:lang w:val="vi"/>
+        </w:rPr>
+        <w:t xml:space="preserve">Duyệt Genealogy, chỉnh Sponsor và placement, cấu hình plan, review bonus, đóng period và release bonus đều làm trong PillarsHub Portal. Builder có các phần thiết yếu ngay trong Helm, cùng một link</w:t>
+      </w:r>
+      <w:r>
+        <w:rPr>
+          <w:lang w:val="vi"/>
+        </w:rPr>
+        <w:t xml:space="preserve"> </w:t>
+      </w:r>
+      <w:r>
+        <w:rPr>
+          <w:lang w:val="vi"/>
+        </w:rPr>
+        <w:t xml:space="preserve">“Open full back office”</w:t>
+      </w:r>
+      <w:r>
+        <w:rPr>
+          <w:lang w:val="vi"/>
+        </w:rPr>
+        <w:t xml:space="preserve"> </w:t>
+      </w:r>
+      <w:r>
+        <w:rPr>
+          <w:lang w:val="vi"/>
+        </w:rPr>
+        <w:t xml:space="preserve">mở vào back office của PillarsHub qua single sign-on. Verified (SSO). Helm chỉ build những gì PillarsHub chưa có.</w:t>
       </w:r>
     </w:p>
     <w:p>
@@ -1262,10 +1315,10 @@
         <w:tblLook w:firstRow="1" w:lastRow="0" w:firstColumn="0" w:lastColumn="0" w:noHBand="0" w:noVBand="0" w:val="0020"/>
       </w:tblPr>
       <w:tblGrid>
-        <w:gridCol w:w="1283"/>
-        <w:gridCol w:w="2488"/>
-        <w:gridCol w:w="2543"/>
-        <w:gridCol w:w="1604"/>
+        <w:gridCol w:w="1240"/>
+        <w:gridCol w:w="2517"/>
+        <w:gridCol w:w="2612"/>
+        <w:gridCol w:w="1550"/>
       </w:tblGrid>
       <w:tr>
         <w:trPr>
@@ -1739,35 +1792,93 @@
               <w:rPr>
                 <w:lang w:val="vi"/>
               </w:rPr>
-              <w:t xml:space="preserve">Team view</w:t>
-            </w:r>
-          </w:p>
-        </w:tc>
-        <w:tc>
-          <w:tcPr/>
-          <w:p>
-            <w:pPr>
-              <w:pStyle w:val="Compact"/>
-            </w:pPr>
-            <w:r>
-              <w:rPr>
-                <w:lang w:val="vi"/>
-              </w:rPr>
-              <w:t xml:space="preserve">Dữ liệu tree và bonus của PillarsHub</w:t>
-            </w:r>
-          </w:p>
-        </w:tc>
-        <w:tc>
-          <w:tcPr/>
-          <w:p>
-            <w:pPr>
-              <w:pStyle w:val="Compact"/>
-            </w:pPr>
-            <w:r>
-              <w:rPr>
-                <w:lang w:val="vi"/>
-              </w:rPr>
-              <w:t xml:space="preserve">Direct-team view trong Helm, lọc theo permission</w:t>
+              <w:t xml:space="preserve">Team view và Builder back office</w:t>
+            </w:r>
+          </w:p>
+        </w:tc>
+        <w:tc>
+          <w:tcPr/>
+          <w:p>
+            <w:pPr>
+              <w:pStyle w:val="Compact"/>
+            </w:pPr>
+            <w:r>
+              <w:rPr>
+                <w:lang w:val="vi"/>
+              </w:rPr>
+              <w:t xml:space="preserve">Back office của PillarsHub (tree, report, chi tiết bonus) qua SSO</w:t>
+            </w:r>
+          </w:p>
+        </w:tc>
+        <w:tc>
+          <w:tcPr/>
+          <w:p>
+            <w:pPr>
+              <w:pStyle w:val="Compact"/>
+            </w:pPr>
+            <w:r>
+              <w:rPr>
+                <w:lang w:val="vi"/>
+              </w:rPr>
+              <w:t xml:space="preserve">Phần thiết yếu trong Helm (referral link, số lượng team, tóm tắt earning, payout) và bước chuyển sang qua SSO</w:t>
+            </w:r>
+          </w:p>
+        </w:tc>
+        <w:tc>
+          <w:tcPr/>
+          <w:p>
+            <w:pPr>
+              <w:pStyle w:val="Compact"/>
+            </w:pPr>
+            <w:r>
+              <w:rPr>
+                <w:lang w:val="vi"/>
+              </w:rPr>
+              <w:t xml:space="preserve">Khả thi</w:t>
+            </w:r>
+          </w:p>
+        </w:tc>
+      </w:tr>
+      <w:tr>
+        <w:tc>
+          <w:tcPr/>
+          <w:p>
+            <w:pPr>
+              <w:pStyle w:val="Compact"/>
+            </w:pPr>
+            <w:r>
+              <w:rPr>
+                <w:lang w:val="vi"/>
+              </w:rPr>
+              <w:t xml:space="preserve">Quản trị MLM</w:t>
+            </w:r>
+          </w:p>
+        </w:tc>
+        <w:tc>
+          <w:tcPr/>
+          <w:p>
+            <w:pPr>
+              <w:pStyle w:val="Compact"/>
+            </w:pPr>
+            <w:r>
+              <w:rPr>
+                <w:lang w:val="vi"/>
+              </w:rPr>
+              <w:t xml:space="preserve">PillarsHub Portal (Genealogy, placement, plan, bonus, đóng period, release)</w:t>
+            </w:r>
+          </w:p>
+        </w:tc>
+        <w:tc>
+          <w:tcPr/>
+          <w:p>
+            <w:pPr>
+              <w:pStyle w:val="Compact"/>
+            </w:pPr>
+            <w:r>
+              <w:rPr>
+                <w:lang w:val="vi"/>
+              </w:rPr>
+              <w:t xml:space="preserve">Deep link theo Member ID; phát hiện thay đổi và reconciliation</w:t>
             </w:r>
           </w:p>
         </w:tc>
@@ -2537,21 +2648,21 @@
               <w:rPr>
                 <w:lang w:val="vi"/>
               </w:rPr>
-              <w:t xml:space="preserve">Direct-team view, referral link, trạng thái thu nhập và statement</w:t>
-            </w:r>
-          </w:p>
-        </w:tc>
-        <w:tc>
-          <w:tcPr/>
-          <w:p>
-            <w:pPr>
-              <w:pStyle w:val="Compact"/>
-            </w:pPr>
-            <w:r>
-              <w:rPr>
-                <w:lang w:val="vi"/>
-              </w:rPr>
-              <w:t xml:space="preserve">Team analytics chuyên sâu, công cụ liên hệ cho leader, CRM</w:t>
+              <w:t xml:space="preserve">Referral link, số lượng team, tóm tắt earning và payout trong Helm; back office đầy đủ trong PillarsHub qua SSO</w:t>
+            </w:r>
+          </w:p>
+        </w:tc>
+        <w:tc>
+          <w:tcPr/>
+          <w:p>
+            <w:pPr>
+              <w:pStyle w:val="Compact"/>
+            </w:pPr>
+            <w:r>
+              <w:rPr>
+                <w:lang w:val="vi"/>
+              </w:rPr>
+              <w:t xml:space="preserve">Bản Helm tự build của các màn hình PillarsHub; team analytics chuyên sâu, công cụ liên hệ cho leader, CRM</w:t>
             </w:r>
           </w:p>
         </w:tc>
@@ -4397,9 +4508,9 @@
         <w:tblLook w:firstRow="1" w:lastRow="0" w:firstColumn="0" w:lastColumn="0" w:noHBand="0" w:noVBand="0" w:val="0020"/>
       </w:tblPr>
       <w:tblGrid>
-        <w:gridCol w:w="661"/>
-        <w:gridCol w:w="4018"/>
-        <w:gridCol w:w="3240"/>
+        <w:gridCol w:w="649"/>
+        <w:gridCol w:w="4091"/>
+        <w:gridCol w:w="3179"/>
       </w:tblGrid>
       <w:tr>
         <w:trPr>
@@ -4487,7 +4598,7 @@
               <w:rPr>
                 <w:lang w:val="vi"/>
               </w:rPr>
-              <w:t xml:space="preserve">Quyết định D1–D12; vault strategy và Manager; MLA; alpha records; soạn cơ sở tính Commission; engage counsel</w:t>
+              <w:t xml:space="preserve">Quyết định D1–D13; vault strategy và Manager; MLA; alpha records; soạn cơ sở tính Commission; engage counsel</w:t>
             </w:r>
           </w:p>
         </w:tc>
@@ -4561,7 +4672,7 @@
               <w:rPr>
                 <w:lang w:val="vi"/>
               </w:rPr>
-              <w:t xml:space="preserve">Team view, statement, admin approval, screening, support context; release candidate cho preregistration</w:t>
+              <w:t xml:space="preserve">Phần thiết yếu cho Builder và PillarsHub SSO, admin approval, screening, support context; release candidate cho preregistration</w:t>
             </w:r>
           </w:p>
         </w:tc>
@@ -5435,10 +5546,10 @@
         <w:tblLook w:firstRow="1" w:lastRow="0" w:firstColumn="0" w:lastColumn="0" w:noHBand="0" w:noVBand="0" w:val="0020"/>
       </w:tblPr>
       <w:tblGrid>
-        <w:gridCol w:w="558"/>
-        <w:gridCol w:w="1603"/>
-        <w:gridCol w:w="3486"/>
-        <w:gridCol w:w="2271"/>
+        <w:gridCol w:w="546"/>
+        <w:gridCol w:w="1579"/>
+        <w:gridCol w:w="3439"/>
+        <w:gridCol w:w="2354"/>
       </w:tblGrid>
       <w:tr>
         <w:trPr>
@@ -6217,6 +6328,64 @@
                 <w:lang w:val="vi"/>
               </w:rPr>
               <w:t xml:space="preserve">của Terrel với stack đã chốt</w:t>
+            </w:r>
+          </w:p>
+        </w:tc>
+      </w:tr>
+      <w:tr>
+        <w:tc>
+          <w:tcPr/>
+          <w:p>
+            <w:pPr>
+              <w:pStyle w:val="Compact"/>
+            </w:pPr>
+            <w:r>
+              <w:rPr>
+                <w:lang w:val="vi"/>
+              </w:rPr>
+              <w:t xml:space="preserve">D13</w:t>
+            </w:r>
+          </w:p>
+        </w:tc>
+        <w:tc>
+          <w:tcPr/>
+          <w:p>
+            <w:pPr>
+              <w:pStyle w:val="Compact"/>
+            </w:pPr>
+            <w:r>
+              <w:rPr>
+                <w:lang w:val="vi"/>
+              </w:rPr>
+              <w:t xml:space="preserve">MLM admin và Builder back office</w:t>
+            </w:r>
+          </w:p>
+        </w:tc>
+        <w:tc>
+          <w:tcPr/>
+          <w:p>
+            <w:pPr>
+              <w:pStyle w:val="Compact"/>
+            </w:pPr>
+            <w:r>
+              <w:rPr>
+                <w:lang w:val="vi"/>
+              </w:rPr>
+              <w:t xml:space="preserve">Dùng PillarsHub Portal và back office (SSO) thay vì build trong Helm; Helm chỉ hiển thị phần thiết yếu</w:t>
+            </w:r>
+          </w:p>
+        </w:tc>
+        <w:tc>
+          <w:tcPr/>
+          <w:p>
+            <w:pPr>
+              <w:pStyle w:val="Compact"/>
+            </w:pPr>
+            <w:r>
+              <w:rPr>
+                <w:lang w:val="vi"/>
+              </w:rPr>
+              <w:t xml:space="preserve">Tiết kiệm nhiều tuần làm UI; cần xác nhận cơ chế approval của PillarsHub Portal và cách xử lý SSO token</w:t>
             </w:r>
           </w:p>
         </w:tc>
@@ -6337,10 +6506,10 @@
         <w:tblLook w:firstRow="1" w:lastRow="0" w:firstColumn="0" w:lastColumn="0" w:noHBand="0" w:noVBand="0" w:val="0020"/>
       </w:tblPr>
       <w:tblGrid>
-        <w:gridCol w:w="1546"/>
-        <w:gridCol w:w="1340"/>
-        <w:gridCol w:w="4074"/>
-        <w:gridCol w:w="958"/>
+        <w:gridCol w:w="1516"/>
+        <w:gridCol w:w="1314"/>
+        <w:gridCol w:w="4148"/>
+        <w:gridCol w:w="939"/>
       </w:tblGrid>
       <w:tr>
         <w:trPr>
@@ -7116,7 +7285,7 @@
               <w:rPr>
                 <w:lang w:val="vi"/>
               </w:rPr>
-              <w:t xml:space="preserve">Referral link, dữ liệu team được phép xem, trạng thái earning, statement, dispute request; mobile web và ngôn ngữ của release</w:t>
+              <w:t xml:space="preserve">Phần thiết yếu trong Helm (referral link, số lượng team, tóm tắt earning, payout, dispute request); statement chi tiết và tree nằm trong back office của PillarsHub qua SSO; mobile web và ngôn ngữ của release (hành vi trên mobile của back office PillarsHub: TBD)</w:t>
             </w:r>
           </w:p>
         </w:tc>
@@ -8351,9 +8520,9 @@
         <w:tblLook w:firstRow="1" w:lastRow="0" w:firstColumn="0" w:lastColumn="0" w:noHBand="0" w:noVBand="0" w:val="0020"/>
       </w:tblPr>
       <w:tblGrid>
-        <w:gridCol w:w="688"/>
-        <w:gridCol w:w="1672"/>
-        <w:gridCol w:w="5559"/>
+        <w:gridCol w:w="668"/>
+        <w:gridCol w:w="1624"/>
+        <w:gridCol w:w="5626"/>
       </w:tblGrid>
       <w:tr>
         <w:trPr>
@@ -9101,7 +9270,7 @@
               <w:rPr>
                 <w:lang w:val="vi"/>
               </w:rPr>
-              <w:t xml:space="preserve">Builder thấy Referral link, các member trong direct team và số lượng kèm độ mới của dữ liệu; không thấy được nhánh khác hay balance, position, trade hoặc support case của bất kỳ ai (TEAM-01, TEAM-02, BO-01)</w:t>
+              <w:t xml:space="preserve">Builder thấy Referral link và số lượng direct team kèm độ mới của dữ liệu trong Helm, và mở back office của PillarsHub qua SSO để xem tree và report; cả hai view đều không để lộ nhánh khác hay balance, position, trade hoặc support case của bất kỳ ai (TEAM-01, TEAM-02, BO-01; cần xác nhận visibility setting của PillarsHub)</w:t>
             </w:r>
           </w:p>
         </w:tc>
@@ -9233,7 +9402,7 @@
               <w:rPr>
                 <w:lang w:val="vi"/>
               </w:rPr>
-              <w:t xml:space="preserve">Builder thấy các khoản calculated, pending, held, payable và paid kèm lý do (COMP-03); statement theo period tách hiệu quả vault khỏi earning từ Referral (AUD-03); dispute request mang theo earning ID (BO-02)</w:t>
+              <w:t xml:space="preserve">Builder thấy tóm tắt earning và payout trong Helm, còn statement bonus chi tiết nằm trong back office của PillarsHub; các trạng thái hiển thị gồm calculated, pending, held, payable và paid kèm lý do (COMP-03); statement theo period tách hiệu quả vault khỏi earning từ Referral (AUD-03); dispute request mang theo earning ID (BO-02)</w:t>
             </w:r>
           </w:p>
         </w:tc>
@@ -9507,9 +9676,9 @@
         <w:tblLook w:firstRow="1" w:lastRow="0" w:firstColumn="0" w:lastColumn="0" w:noHBand="0" w:noVBand="0" w:val="0020"/>
       </w:tblPr>
       <w:tblGrid>
-        <w:gridCol w:w="1650"/>
-        <w:gridCol w:w="3772"/>
-        <w:gridCol w:w="2497"/>
+        <w:gridCol w:w="1604"/>
+        <w:gridCol w:w="3832"/>
+        <w:gridCol w:w="2483"/>
       </w:tblGrid>
       <w:tr>
         <w:trPr>
@@ -9847,21 +10016,65 @@
               <w:rPr>
                 <w:lang w:val="vi"/>
               </w:rPr>
-              <w:t xml:space="preserve">Exception, screening case, trạng thái allowlist, Sponsor correction, import exception, review payout batch và hold, tất cả đều có maker-checker</w:t>
-            </w:r>
-          </w:p>
-        </w:tc>
-        <w:tc>
-          <w:tcPr/>
-          <w:p>
-            <w:pPr>
-              <w:pStyle w:val="Compact"/>
-            </w:pPr>
-            <w:r>
-              <w:rPr>
-                <w:lang w:val="vi"/>
-              </w:rPr>
-              <w:t xml:space="preserve">Workflow approval (ADM-02) trải qua nhiều provider</w:t>
+              <w:t xml:space="preserve">Chỉ dữ liệu do Helm sở hữu: exception, screening case, trạng thái allowlist, import exception, thực thi payout và hold, có maker-checker; deep link sang PillarsHub Portal cho Genealogy, plan, bonus và release</w:t>
+            </w:r>
+          </w:p>
+        </w:tc>
+        <w:tc>
+          <w:tcPr/>
+          <w:p>
+            <w:pPr>
+              <w:pStyle w:val="Compact"/>
+            </w:pPr>
+            <w:r>
+              <w:rPr>
+                <w:lang w:val="vi"/>
+              </w:rPr>
+              <w:t xml:space="preserve">PillarsHub Portal lo phần quản trị MLM; Helm lo identity, wallet và dòng tiền</w:t>
+            </w:r>
+          </w:p>
+        </w:tc>
+      </w:tr>
+      <w:tr>
+        <w:tc>
+          <w:tcPr/>
+          <w:p>
+            <w:pPr>
+              <w:pStyle w:val="Compact"/>
+            </w:pPr>
+            <w:r>
+              <w:rPr>
+                <w:lang w:val="vi"/>
+              </w:rPr>
+              <w:t xml:space="preserve">PillarsHub Portal và back office (tái sử dụng)</w:t>
+            </w:r>
+          </w:p>
+        </w:tc>
+        <w:tc>
+          <w:tcPr/>
+          <w:p>
+            <w:pPr>
+              <w:pStyle w:val="Compact"/>
+            </w:pPr>
+            <w:r>
+              <w:rPr>
+                <w:lang w:val="vi"/>
+              </w:rPr>
+              <w:t xml:space="preserve">Duyệt Genealogy, chỉnh Sponsor và placement, plan, bonus, đóng period, release, report MLM; Builder back office qua SSO</w:t>
+            </w:r>
+          </w:p>
+        </w:tc>
+        <w:tc>
+          <w:tcPr/>
+          <w:p>
+            <w:pPr>
+              <w:pStyle w:val="Compact"/>
+            </w:pPr>
+            <w:r>
+              <w:rPr>
+                <w:lang w:val="vi"/>
+              </w:rPr>
+              <w:t xml:space="preserve">Không tự build: tái sử dụng để tiết kiệm thời gian build</w:t>
             </w:r>
           </w:p>
         </w:tc>
@@ -13631,7 +13844,32 @@
         <w:rPr>
           <w:lang w:val="vi"/>
         </w:rPr>
-        <w:t xml:space="preserve">không bao giờ cho self-service trong Pilot. Chỉ admin được làm, kèm lý do, consent reference, approval thứ hai và audit entry, sau đó update node hoặc placement trong PillarsHub và read-back. Placement window có quản lý (preview, consent, deadline, notification; GEN-04 đến GEN-06) chỉ được bật sau khi policy được duyệt (quyết định D10). Customer movement giữ ở trạng thái tắt trong tree của PillarsHub để hai hệ thống không bị lệch nhau.</w:t>
+        <w:t xml:space="preserve">không bao giờ cho self-service trong Pilot. Admin được ủy quyền thực hiện trong PillarsHub Portal, với lý do và consent reference được ghi vào một case trong Helm. Helm phát hiện mọi thay đổi qua webhook</w:t>
+      </w:r>
+      <w:r>
+        <w:rPr>
+          <w:lang w:val="vi"/>
+        </w:rPr>
+        <w:t xml:space="preserve"> </w:t>
+      </w:r>
+      <w:r>
+        <w:rPr>
+          <w:rStyle w:val="VerbatimChar"/>
+          <w:lang w:val="vi"/>
+        </w:rPr>
+        <w:t xml:space="preserve">Node/Updated</w:t>
+      </w:r>
+      <w:r>
+        <w:rPr>
+          <w:lang w:val="vi"/>
+        </w:rPr>
+        <w:t xml:space="preserve"> </w:t>
+      </w:r>
+      <w:r>
+        <w:rPr>
+          <w:lang w:val="vi"/>
+        </w:rPr>
+        <w:t xml:space="preserve">và reconciliation hằng đêm, và mở case cho bất kỳ thay đổi nào không có request đã duyệt. Chưa verify được bản thân Portal có bắt buộc người duyệt thứ hai và lưu audit log hay không; nếu không, approval được ghi trong Helm trước khi sửa trên Portal (ADM-02). Placement window có quản lý (preview, consent, deadline, notification; GEN-04 đến GEN-06) chỉ được bật sau khi policy được duyệt (quyết định D10). Customer movement giữ ở trạng thái tắt trong tree của PillarsHub để hai hệ thống không bị lệch nhau.</w:t>
       </w:r>
     </w:p>
     <w:p>
@@ -14079,9 +14317,9 @@
         <w:tblLook w:firstRow="1" w:lastRow="0" w:firstColumn="0" w:lastColumn="0" w:noHBand="0" w:noVBand="0" w:val="0020"/>
       </w:tblPr>
       <w:tblGrid>
-        <w:gridCol w:w="1023"/>
-        <w:gridCol w:w="5388"/>
-        <w:gridCol w:w="1508"/>
+        <w:gridCol w:w="1004"/>
+        <w:gridCol w:w="5434"/>
+        <w:gridCol w:w="1480"/>
       </w:tblGrid>
       <w:tr>
         <w:trPr>
@@ -14249,7 +14487,7 @@
               <w:rPr>
                 <w:lang w:val="vi"/>
               </w:rPr>
-              <w:t xml:space="preserve">Vault terms và disclosure; tự động hóa allowlist; team view và statement; Builder enrollment và terms; approval, hold và reporting cho payout; diễn tập và reconciliation cho alpha import; support agent view, FAQ và runbook; reconciliation job và alert; eligibility theo quốc gia; môi trường production; load test và recovery test; fix các finding từ security review; diễn tập vận hành</w:t>
+              <w:t xml:space="preserve">Vault terms và disclosure; tự động hóa allowlist; phần thiết yếu cho Builder và bước chuyển sang PillarsHub qua SSO; Builder enrollment và terms; approval, hold và reporting cho payout; diễn tập và reconciliation cho alpha import; support agent view, FAQ và runbook; reconciliation job và alert; eligibility theo quốc gia; môi trường production; load test và recovery test; fix các finding từ security review; diễn tập vận hành</w:t>
             </w:r>
           </w:p>
         </w:tc>
@@ -14340,7 +14578,7 @@
         <w:rPr>
           <w:lang w:val="vi"/>
         </w:rPr>
-        <w:t xml:space="preserve">Các quyết định D1–D12 trong buổi họp.</w:t>
+        <w:t xml:space="preserve">Các quyết định D1–D13 trong buổi họp.</w:t>
       </w:r>
     </w:p>
     <w:p>
@@ -14919,6 +15157,35 @@
           <w:lang w:val="vi"/>
         </w:rPr>
         <w:t xml:space="preserve">Chỉ coi là tín hiệu và fetch lại qua API. Verified.</w:t>
+      </w:r>
+    </w:p>
+    <w:p>
+      <w:pPr>
+        <w:pStyle w:val="Compact"/>
+        <w:numPr>
+          <w:ilvl w:val="0"/>
+          <w:numId w:val="1015"/>
+        </w:numPr>
+      </w:pPr>
+      <w:r>
+        <w:rPr>
+          <w:b/>
+          <w:bCs/>
+          <w:lang w:val="vi"/>
+        </w:rPr>
+        <w:t xml:space="preserve">PillarsHub SSO.</w:t>
+      </w:r>
+      <w:r>
+        <w:rPr>
+          <w:lang w:val="vi"/>
+        </w:rPr>
+        <w:t xml:space="preserve"> </w:t>
+      </w:r>
+      <w:r>
+        <w:rPr>
+          <w:lang w:val="vi"/>
+        </w:rPr>
+        <w:t xml:space="preserve">Backend của Helm mint một PillarsHub user token và mở back office với token nằm trong URL query string. Verified. Token trong URL có thể bị lộ qua browser history và log; cần xác nhận với PillarsHub về thời hạn token và việc chỉ dùng một lần, và mở back office trong tab mới, không gửi referrer header.</w:t>
       </w:r>
     </w:p>
     <w:p>
@@ -19204,6 +19471,36 @@
           <w:lang w:val="vi"/>
         </w:rPr>
         <w:t xml:space="preserve">Customer type hoặc status để phân biệt Customer với Builder, và cho người ở trạng thái preregistered không được nhận earning.</w:t>
+      </w:r>
+    </w:p>
+    <w:p>
+      <w:pPr>
+        <w:pStyle w:val="Compact"/>
+        <w:numPr>
+          <w:ilvl w:val="0"/>
+          <w:numId w:val="1017"/>
+        </w:numPr>
+      </w:pPr>
+      <w:r>
+        <w:rPr>
+          <w:lang w:val="vi"/>
+        </w:rPr>
+        <w:t xml:space="preserve">Portal có hỗ trợ approval theo role (người duyệt thứ hai) và audit log cho việc đổi Sponsor và placement, sửa bonus và release không?</w:t>
+      </w:r>
+    </w:p>
+    <w:p>
+      <w:pPr>
+        <w:pStyle w:val="Compact"/>
+        <w:numPr>
+          <w:ilvl w:val="0"/>
+          <w:numId w:val="1017"/>
+        </w:numPr>
+      </w:pPr>
+      <w:r>
+        <w:rPr>
+          <w:lang w:val="vi"/>
+        </w:rPr>
+        <w:t xml:space="preserve">SSO user token: thời hạn, chỉ dùng một lần, và có cách exchange qua POST hoặc token ngắn hạn thay vì đặt token trong URL không? Có giới hạn được visibility của back office để Builder không bao giờ thấy nhánh khác hay balance không, và back office hoạt động thế nào trên mobile?</w:t>
       </w:r>
     </w:p>
     <w:p>

</xml_diff>